<commit_message>
updated debugger connection and ignore files
</commit_message>
<xml_diff>
--- a/1tops_soc/src/debugger/soc_debugger_architecture.docx
+++ b/1tops_soc/src/debugger/soc_debugger_architecture.docx
@@ -33,7 +33,7 @@
     </w:p>
     <w:p>
       <w:r>
-        <w:t>To keep the hardware clean and fast, all unused legacy pins (USRT, FT1248, unused GPIOs) and duplicate UART transceivers were trimmed away. The debugger directly reuses the SoC's existing 16550 UART in uncore over internal streaming wires. Five key building blocks exist in the active design:</w:t>
+        <w:t>To keep the hardware clean and fast, all unused legacy pins (USRT, FT1248, unused GPIOs) were trimmed away. Only four key building blocks exist in the active design:</w:t>
       </w:r>
     </w:p>
     <w:tbl>
@@ -106,7 +106,7 @@
           </w:tcPr>
           <w:p>
             <w:r>
-              <w:t>Connects via standard 2-wire serial (UARTSin / UARTSout) at 115,200 baud to the existing on-chip Uncore 16550 UART.</w:t>
+              <w:t>Connects via standard 2-wire serial (uart_rx / uart_tx) at 115,200 baud.</w:t>
             </w:r>
           </w:p>
         </w:tc>
@@ -138,7 +138,7 @@
           </w:tcPr>
           <w:p>
             <w:r>
-              <w:t>Connects to Uncore UART via internal streaming wires (uart_rx_* / uart_tx_*); sends 'core_halt_o' to freeze CPU; drives AHB Master 1.</w:t>
+              <w:t>Sends 'core_halt_o' to freeze CPU; drives AHB Master 1 to read/write memory.</w:t>
             </w:r>
           </w:p>
         </w:tc>
@@ -303,7 +303,7 @@
           </w:tcPr>
           <w:p>
             <w:r>
-              <w:t>UARTSin</w:t>
+              <w:t>uart_rx</w:t>
             </w:r>
           </w:p>
         </w:tc>
@@ -323,7 +323,7 @@
           </w:tcPr>
           <w:p>
             <w:r>
-              <w:t>External physical serial pin receiving commands from PC into Uncore 16550 UART (115200 baud).</w:t>
+              <w:t>Commands flow into chip from PC (115200 baud).</w:t>
             </w:r>
           </w:p>
         </w:tc>
@@ -335,7 +335,7 @@
           </w:tcPr>
           <w:p>
             <w:r>
-              <w:t>UARTSout</w:t>
+              <w:t>uart_tx</w:t>
             </w:r>
           </w:p>
         </w:tc>
@@ -355,71 +355,7 @@
           </w:tcPr>
           <w:p>
             <w:r>
-              <w:t>External physical serial pin transmitting responses from Uncore UART back to PC screen.</w:t>
-            </w:r>
-          </w:p>
-        </w:tc>
-      </w:tr>
-      <w:tr>
-        <w:tc>
-          <w:tcPr>
-            <w:tcW w:type="dxa" w:w="3312"/>
-          </w:tcPr>
-          <w:p>
-            <w:r>
-              <w:t>dbg_uart_rx_data[7:0] / valid</w:t>
-            </w:r>
-          </w:p>
-        </w:tc>
-        <w:tc>
-          <w:tcPr>
-            <w:tcW w:type="dxa" w:w="3312"/>
-          </w:tcPr>
-          <w:p>
-            <w:r>
-              <w:t>Internal (9-bit)</w:t>
-            </w:r>
-          </w:p>
-        </w:tc>
-        <w:tc>
-          <w:tcPr>
-            <w:tcW w:type="dxa" w:w="3312"/>
-          </w:tcPr>
-          <w:p>
-            <w:r>
-              <w:t>Deserialized character stream from Uncore UART to Debugger ADP engine.</w:t>
-            </w:r>
-          </w:p>
-        </w:tc>
-      </w:tr>
-      <w:tr>
-        <w:tc>
-          <w:tcPr>
-            <w:tcW w:type="dxa" w:w="3312"/>
-          </w:tcPr>
-          <w:p>
-            <w:r>
-              <w:t>dbg_uart_tx_data[7:0] / valid</w:t>
-            </w:r>
-          </w:p>
-        </w:tc>
-        <w:tc>
-          <w:tcPr>
-            <w:tcW w:type="dxa" w:w="3312"/>
-          </w:tcPr>
-          <w:p>
-            <w:r>
-              <w:t>Internal (9-bit)</w:t>
-            </w:r>
-          </w:p>
-        </w:tc>
-        <w:tc>
-          <w:tcPr>
-            <w:tcW w:type="dxa" w:w="3312"/>
-          </w:tcPr>
-          <w:p>
-            <w:r>
-              <w:t>Response character stream from Debugger ADP engine into Uncore UART TX register.</w:t>
+              <w:t>Responses flow out of chip back to your PC screen.</w:t>
             </w:r>
           </w:p>
         </w:tc>

</xml_diff>